<commit_message>
feat(automation): expand UI E2E with real images and Word-default table template
Add AC-UI-B03/B04/B05 real-image flows, automation form presets, and image width refit after min-height upscale. Regenerate fixtures with Word9 AutoFitFixed to match Insert Table defaults; document perf baseline gate.

Co-authored-by: Cursor <cursoragent@cursor.com>
</commit_message>
<xml_diff>
--- a/automation/assets/blank.docx
+++ b/automation/assets/blank.docx
@@ -4,77 +4,179 @@
   <w:body>
     <w:tbl>
       <w:tblPr>
+        <w:tblStyle w:val="a3"/>
         <w:tblW w:w="0" w:type="auto"/>
-        <w:tblLayout w:type="fixed"/>
-        <w:tblLook w:val="0000" w:firstRow="0" w:lastRow="0" w:firstColumn="0" w:lastColumn="0" w:noHBand="0" w:noVBand="0"/>
+        <w:tblLook w:val="04A0" w:firstRow="1" w:lastRow="0" w:firstColumn="1" w:lastColumn="0" w:noHBand="0" w:noVBand="1"/>
       </w:tblPr>
       <w:tblGrid>
-        <w:gridCol w:w="4153"/>
-        <w:gridCol w:w="4153"/>
+        <w:gridCol w:w="4148"/>
+        <w:gridCol w:w="4148"/>
       </w:tblGrid>
       <w:tr>
-        <w:tblPrEx>
-          <w:tblCellMar>
-            <w:top w:w="0" w:type="dxa"/>
-            <w:bottom w:w="0" w:type="dxa"/>
-          </w:tblCellMar>
-        </w:tblPrEx>
-        <w:tc>
-          <w:tcPr>
-            <w:tcW w:w="4153" w:type="dxa"/>
-          </w:tcPr>
-          <w:p/>
-          <w:p/>
-        </w:tc>
-        <w:tc>
-          <w:tcPr>
-            <w:tcW w:w="4153" w:type="dxa"/>
-          </w:tcPr>
-          <w:p/>
-          <w:p/>
-        </w:tc>
-      </w:tr>
-      <w:tr>
-        <w:tblPrEx>
-          <w:tblCellMar>
-            <w:top w:w="0" w:type="dxa"/>
-            <w:bottom w:w="0" w:type="dxa"/>
-          </w:tblCellMar>
-        </w:tblPrEx>
-        <w:tc>
-          <w:tcPr>
-            <w:tcW w:w="4153" w:type="dxa"/>
-          </w:tcPr>
-          <w:p/>
-          <w:p/>
-        </w:tc>
-        <w:tc>
-          <w:tcPr>
-            <w:tcW w:w="4153" w:type="dxa"/>
-          </w:tcPr>
-          <w:p/>
-          <w:p/>
-        </w:tc>
-      </w:tr>
-      <w:tr>
-        <w:tblPrEx>
-          <w:tblCellMar>
-            <w:top w:w="0" w:type="dxa"/>
-            <w:bottom w:w="0" w:type="dxa"/>
-          </w:tblCellMar>
-        </w:tblPrEx>
-        <w:tc>
-          <w:tcPr>
-            <w:tcW w:w="4153" w:type="dxa"/>
-          </w:tcPr>
-          <w:p/>
-          <w:p/>
-        </w:tc>
-        <w:tc>
-          <w:tcPr>
-            <w:tcW w:w="4153" w:type="dxa"/>
-          </w:tcPr>
-          <w:p/>
+        <w:tc>
+          <w:tcPr>
+            <w:tcW w:w="4148" w:type="dxa"/>
+          </w:tcPr>
+          <w:p/>
+        </w:tc>
+        <w:tc>
+          <w:tcPr>
+            <w:tcW w:w="4148" w:type="dxa"/>
+          </w:tcPr>
+          <w:p/>
+        </w:tc>
+      </w:tr>
+      <w:tr>
+        <w:tc>
+          <w:tcPr>
+            <w:tcW w:w="4148" w:type="dxa"/>
+          </w:tcPr>
+          <w:p/>
+        </w:tc>
+        <w:tc>
+          <w:tcPr>
+            <w:tcW w:w="4148" w:type="dxa"/>
+          </w:tcPr>
+          <w:p/>
+        </w:tc>
+      </w:tr>
+      <w:tr>
+        <w:tc>
+          <w:tcPr>
+            <w:tcW w:w="4148" w:type="dxa"/>
+          </w:tcPr>
+          <w:p/>
+        </w:tc>
+        <w:tc>
+          <w:tcPr>
+            <w:tcW w:w="4148" w:type="dxa"/>
+          </w:tcPr>
+          <w:p/>
+        </w:tc>
+      </w:tr>
+      <w:tr>
+        <w:tc>
+          <w:tcPr>
+            <w:tcW w:w="4148" w:type="dxa"/>
+          </w:tcPr>
+          <w:p/>
+        </w:tc>
+        <w:tc>
+          <w:tcPr>
+            <w:tcW w:w="4148" w:type="dxa"/>
+          </w:tcPr>
+          <w:p/>
+        </w:tc>
+      </w:tr>
+      <w:tr>
+        <w:tc>
+          <w:tcPr>
+            <w:tcW w:w="4148" w:type="dxa"/>
+          </w:tcPr>
+          <w:p/>
+        </w:tc>
+        <w:tc>
+          <w:tcPr>
+            <w:tcW w:w="4148" w:type="dxa"/>
+          </w:tcPr>
+          <w:p/>
+        </w:tc>
+      </w:tr>
+      <w:tr>
+        <w:tc>
+          <w:tcPr>
+            <w:tcW w:w="4148" w:type="dxa"/>
+          </w:tcPr>
+          <w:p/>
+        </w:tc>
+        <w:tc>
+          <w:tcPr>
+            <w:tcW w:w="4148" w:type="dxa"/>
+          </w:tcPr>
+          <w:p/>
+        </w:tc>
+      </w:tr>
+      <w:tr>
+        <w:tc>
+          <w:tcPr>
+            <w:tcW w:w="4148" w:type="dxa"/>
+          </w:tcPr>
+          <w:p/>
+        </w:tc>
+        <w:tc>
+          <w:tcPr>
+            <w:tcW w:w="4148" w:type="dxa"/>
+          </w:tcPr>
+          <w:p/>
+        </w:tc>
+      </w:tr>
+      <w:tr>
+        <w:tc>
+          <w:tcPr>
+            <w:tcW w:w="4148" w:type="dxa"/>
+          </w:tcPr>
+          <w:p/>
+        </w:tc>
+        <w:tc>
+          <w:tcPr>
+            <w:tcW w:w="4148" w:type="dxa"/>
+          </w:tcPr>
+          <w:p/>
+        </w:tc>
+      </w:tr>
+      <w:tr>
+        <w:tc>
+          <w:tcPr>
+            <w:tcW w:w="4148" w:type="dxa"/>
+          </w:tcPr>
+          <w:p/>
+        </w:tc>
+        <w:tc>
+          <w:tcPr>
+            <w:tcW w:w="4148" w:type="dxa"/>
+          </w:tcPr>
+          <w:p/>
+        </w:tc>
+      </w:tr>
+      <w:tr>
+        <w:tc>
+          <w:tcPr>
+            <w:tcW w:w="4148" w:type="dxa"/>
+          </w:tcPr>
+          <w:p/>
+        </w:tc>
+        <w:tc>
+          <w:tcPr>
+            <w:tcW w:w="4148" w:type="dxa"/>
+          </w:tcPr>
+          <w:p/>
+        </w:tc>
+      </w:tr>
+      <w:tr>
+        <w:tc>
+          <w:tcPr>
+            <w:tcW w:w="4148" w:type="dxa"/>
+          </w:tcPr>
+          <w:p/>
+        </w:tc>
+        <w:tc>
+          <w:tcPr>
+            <w:tcW w:w="4148" w:type="dxa"/>
+          </w:tcPr>
+          <w:p/>
+        </w:tc>
+      </w:tr>
+      <w:tr>
+        <w:tc>
+          <w:tcPr>
+            <w:tcW w:w="4148" w:type="dxa"/>
+          </w:tcPr>
+          <w:p/>
+        </w:tc>
+        <w:tc>
+          <w:tcPr>
+            <w:tcW w:w="4148" w:type="dxa"/>
+          </w:tcPr>
           <w:p/>
         </w:tc>
       </w:tr>
@@ -521,6 +623,25 @@
     <w:semiHidden/>
     <w:unhideWhenUsed/>
   </w:style>
+  <w:style w:type="table" w:styleId="a3">
+    <w:name w:val="Table Grid"/>
+    <w:basedOn w:val="a1"/>
+    <w:uiPriority w:val="39"/>
+    <w:rsid w:val="00E0198A"/>
+    <w:pPr>
+      <w:spacing w:after="0" w:line="240" w:lineRule="auto"/>
+    </w:pPr>
+    <w:tblPr>
+      <w:tblBorders>
+        <w:top w:val="single" w:sz="4" w:space="0" w:color="auto"/>
+        <w:left w:val="single" w:sz="4" w:space="0" w:color="auto"/>
+        <w:bottom w:val="single" w:sz="4" w:space="0" w:color="auto"/>
+        <w:right w:val="single" w:sz="4" w:space="0" w:color="auto"/>
+        <w:insideH w:val="single" w:sz="4" w:space="0" w:color="auto"/>
+        <w:insideV w:val="single" w:sz="4" w:space="0" w:color="auto"/>
+      </w:tblBorders>
+    </w:tblPr>
+  </w:style>
 </w:styles>
 </file>
 

</xml_diff>